<commit_message>
Project 7/V2 - Revised and added a new graph
</commit_message>
<xml_diff>
--- a/Project-7 ---/V2/doc/de novo vs. Recurrent MBC result.docx
+++ b/Project-7 ---/V2/doc/de novo vs. Recurrent MBC result.docx
@@ -10279,7 +10279,7 @@
             <w:tcBorders>
               <w:top w:val="none" w:sz="0" w:space="0" w:color="000000"/>
               <w:left w:val="none" w:sz="0" w:space="0" w:color="000000"/>
-              <w:bottom w:val="single" w:sz="8" w:space="0" w:color="000000"/>
+              <w:bottom w:val="none" w:sz="0" w:space="0" w:color="000000"/>
               <w:right w:val="none" w:sz="0" w:space="0" w:color="000000"/>
             </w:tcBorders>
             <w:shd w:val="clear" w:color="auto" w:fill="FFFFFF"/>
@@ -10324,7 +10324,7 @@
             <w:tcBorders>
               <w:top w:val="none" w:sz="0" w:space="0" w:color="000000"/>
               <w:left w:val="none" w:sz="0" w:space="0" w:color="000000"/>
-              <w:bottom w:val="single" w:sz="8" w:space="0" w:color="000000"/>
+              <w:bottom w:val="none" w:sz="0" w:space="0" w:color="000000"/>
               <w:right w:val="none" w:sz="0" w:space="0" w:color="000000"/>
             </w:tcBorders>
             <w:shd w:val="clear" w:color="auto" w:fill="FFFFFF"/>
@@ -10370,7 +10370,7 @@
             <w:tcBorders>
               <w:top w:val="none" w:sz="0" w:space="0" w:color="000000"/>
               <w:left w:val="none" w:sz="0" w:space="0" w:color="000000"/>
-              <w:bottom w:val="single" w:sz="8" w:space="0" w:color="000000"/>
+              <w:bottom w:val="none" w:sz="0" w:space="0" w:color="000000"/>
               <w:right w:val="none" w:sz="0" w:space="0" w:color="000000"/>
             </w:tcBorders>
             <w:shd w:val="clear" w:color="auto" w:fill="FFFFFF"/>
@@ -10416,7 +10416,7 @@
             <w:tcBorders>
               <w:top w:val="none" w:sz="0" w:space="0" w:color="000000"/>
               <w:left w:val="none" w:sz="0" w:space="0" w:color="000000"/>
-              <w:bottom w:val="single" w:sz="8" w:space="0" w:color="000000"/>
+              <w:bottom w:val="none" w:sz="0" w:space="0" w:color="000000"/>
               <w:right w:val="none" w:sz="0" w:space="0" w:color="000000"/>
             </w:tcBorders>
             <w:shd w:val="clear" w:color="auto" w:fill="FFFFFF"/>
@@ -10462,7 +10462,7 @@
             <w:tcBorders>
               <w:top w:val="none" w:sz="0" w:space="0" w:color="000000"/>
               <w:left w:val="none" w:sz="0" w:space="0" w:color="000000"/>
-              <w:bottom w:val="single" w:sz="8" w:space="0" w:color="000000"/>
+              <w:bottom w:val="none" w:sz="0" w:space="0" w:color="000000"/>
               <w:right w:val="none" w:sz="0" w:space="0" w:color="000000"/>
             </w:tcBorders>
             <w:shd w:val="clear" w:color="auto" w:fill="FFFFFF"/>
@@ -10500,58 +10500,205 @@
         </w:trPr>
         <w:tc>
           <w:tcPr>
-            <w:tcW w:w="9448" w:type="dxa"/>
-            <w:gridSpan w:val="5"/>
-            <w:tcBorders>
-              <w:top w:val="single" w:sz="8" w:space="0" w:color="000000"/>
-              <w:left w:val="none" w:sz="0" w:space="0" w:color="FFFFFF"/>
-              <w:bottom w:val="none" w:sz="0" w:space="0" w:color="FFFFFF"/>
-              <w:right w:val="none" w:sz="0" w:space="0" w:color="FFFFFF"/>
-            </w:tcBorders>
-            <w:shd w:val="clear" w:color="auto" w:fill="FFFFFF"/>
-            <w:tcMar>
-              <w:top w:w="0" w:type="dxa"/>
-              <w:left w:w="0" w:type="dxa"/>
-              <w:bottom w:w="0" w:type="dxa"/>
-              <w:right w:w="0" w:type="dxa"/>
-            </w:tcMar>
-            <w:vAlign w:val="center"/>
-          </w:tcPr>
-          <w:p>
-            <w:pPr>
-              <w:pBdr>
-                <w:top w:val="none" w:sz="0" w:space="0" w:color="000000"/>
-                <w:left w:val="none" w:sz="0" w:space="0" w:color="000000"/>
-                <w:bottom w:val="none" w:sz="0" w:space="0" w:color="000000"/>
-                <w:right w:val="none" w:sz="0" w:space="0" w:color="000000"/>
-              </w:pBdr>
-              <w:spacing w:before="100" w:after="100"/>
-              <w:ind w:left="100" w:right="100"/>
-              <w:rPr>
-                <w:rFonts w:ascii="Arial" w:eastAsia="Arial" w:hAnsi="Arial" w:cs="Arial"/>
-                <w:color w:val="000000"/>
-                <w:sz w:val="22"/>
-                <w:szCs w:val="22"/>
-              </w:rPr>
-            </w:pPr>
-            <w:r>
-              <w:rPr>
-                <w:rFonts w:ascii="Arial" w:eastAsia="Arial" w:hAnsi="Arial" w:cs="Arial"/>
-                <w:color w:val="000000"/>
-                <w:sz w:val="22"/>
-                <w:szCs w:val="22"/>
-                <w:vertAlign w:val="superscript"/>
-              </w:rPr>
-              <w:t>1</w:t>
-            </w:r>
-            <w:r>
-              <w:rPr>
-                <w:rFonts w:ascii="Arial" w:eastAsia="Arial" w:hAnsi="Arial" w:cs="Arial"/>
-                <w:color w:val="000000"/>
-                <w:sz w:val="22"/>
-                <w:szCs w:val="22"/>
-              </w:rPr>
-              <w:t>n (%)</w:t>
+            <w:tcW w:w="2683" w:type="dxa"/>
+            <w:tcBorders>
+              <w:top w:val="none" w:sz="0" w:space="0" w:color="000000"/>
+              <w:left w:val="none" w:sz="0" w:space="0" w:color="000000"/>
+              <w:bottom w:val="none" w:sz="0" w:space="0" w:color="000000"/>
+              <w:right w:val="none" w:sz="0" w:space="0" w:color="000000"/>
+            </w:tcBorders>
+            <w:shd w:val="clear" w:color="auto" w:fill="FFFFFF"/>
+            <w:tcMar>
+              <w:top w:w="0" w:type="dxa"/>
+              <w:left w:w="0" w:type="dxa"/>
+              <w:bottom w:w="0" w:type="dxa"/>
+              <w:right w:w="0" w:type="dxa"/>
+            </w:tcMar>
+          </w:tcPr>
+          <w:p>
+            <w:pPr>
+              <w:pBdr>
+                <w:top w:val="none" w:sz="0" w:space="0" w:color="000000"/>
+                <w:left w:val="none" w:sz="0" w:space="0" w:color="000000"/>
+                <w:bottom w:val="none" w:sz="0" w:space="0" w:color="000000"/>
+                <w:right w:val="none" w:sz="0" w:space="0" w:color="000000"/>
+              </w:pBdr>
+              <w:spacing w:before="100" w:after="100"/>
+              <w:ind w:left="100" w:right="100"/>
+              <w:rPr>
+                <w:rFonts w:ascii="Arial" w:eastAsia="Arial" w:hAnsi="Arial" w:cs="Arial"/>
+                <w:b/>
+                <w:color w:val="000000"/>
+                <w:sz w:val="22"/>
+                <w:szCs w:val="22"/>
+              </w:rPr>
+            </w:pPr>
+            <w:r>
+              <w:rPr>
+                <w:rFonts w:ascii="Arial" w:eastAsia="Arial" w:hAnsi="Arial" w:cs="Arial"/>
+                <w:b/>
+                <w:color w:val="000000"/>
+                <w:sz w:val="22"/>
+                <w:szCs w:val="22"/>
+              </w:rPr>
+              <w:t>Status</w:t>
+            </w:r>
+          </w:p>
+        </w:tc>
+        <w:tc>
+          <w:tcPr>
+            <w:tcW w:w="1426" w:type="dxa"/>
+            <w:tcBorders>
+              <w:top w:val="none" w:sz="0" w:space="0" w:color="000000"/>
+              <w:left w:val="none" w:sz="0" w:space="0" w:color="000000"/>
+              <w:bottom w:val="none" w:sz="0" w:space="0" w:color="000000"/>
+              <w:right w:val="none" w:sz="0" w:space="0" w:color="000000"/>
+            </w:tcBorders>
+            <w:shd w:val="clear" w:color="auto" w:fill="FFFFFF"/>
+            <w:tcMar>
+              <w:top w:w="0" w:type="dxa"/>
+              <w:left w:w="0" w:type="dxa"/>
+              <w:bottom w:w="0" w:type="dxa"/>
+              <w:right w:w="0" w:type="dxa"/>
+            </w:tcMar>
+          </w:tcPr>
+          <w:p>
+            <w:pPr>
+              <w:pBdr>
+                <w:top w:val="none" w:sz="0" w:space="0" w:color="000000"/>
+                <w:left w:val="none" w:sz="0" w:space="0" w:color="000000"/>
+                <w:bottom w:val="none" w:sz="0" w:space="0" w:color="000000"/>
+                <w:right w:val="none" w:sz="0" w:space="0" w:color="000000"/>
+              </w:pBdr>
+              <w:spacing w:before="100" w:after="100"/>
+              <w:ind w:left="100" w:right="100"/>
+              <w:jc w:val="center"/>
+              <w:rPr>
+                <w:rFonts w:ascii="Arial" w:eastAsia="Arial" w:hAnsi="Arial" w:cs="Arial"/>
+                <w:color w:val="000000"/>
+                <w:sz w:val="22"/>
+                <w:szCs w:val="22"/>
+              </w:rPr>
+            </w:pPr>
+          </w:p>
+        </w:tc>
+        <w:tc>
+          <w:tcPr>
+            <w:tcW w:w="1963" w:type="dxa"/>
+            <w:tcBorders>
+              <w:top w:val="none" w:sz="0" w:space="0" w:color="000000"/>
+              <w:left w:val="none" w:sz="0" w:space="0" w:color="000000"/>
+              <w:bottom w:val="none" w:sz="0" w:space="0" w:color="000000"/>
+              <w:right w:val="none" w:sz="0" w:space="0" w:color="000000"/>
+            </w:tcBorders>
+            <w:shd w:val="clear" w:color="auto" w:fill="FFFFFF"/>
+            <w:tcMar>
+              <w:top w:w="0" w:type="dxa"/>
+              <w:left w:w="0" w:type="dxa"/>
+              <w:bottom w:w="0" w:type="dxa"/>
+              <w:right w:w="0" w:type="dxa"/>
+            </w:tcMar>
+          </w:tcPr>
+          <w:p>
+            <w:pPr>
+              <w:pBdr>
+                <w:top w:val="none" w:sz="0" w:space="0" w:color="000000"/>
+                <w:left w:val="none" w:sz="0" w:space="0" w:color="000000"/>
+                <w:bottom w:val="none" w:sz="0" w:space="0" w:color="000000"/>
+                <w:right w:val="none" w:sz="0" w:space="0" w:color="000000"/>
+              </w:pBdr>
+              <w:spacing w:before="100" w:after="100"/>
+              <w:ind w:left="100" w:right="100"/>
+              <w:jc w:val="center"/>
+              <w:rPr>
+                <w:rFonts w:ascii="Arial" w:eastAsia="Arial" w:hAnsi="Arial" w:cs="Arial"/>
+                <w:color w:val="000000"/>
+                <w:sz w:val="22"/>
+                <w:szCs w:val="22"/>
+              </w:rPr>
+            </w:pPr>
+          </w:p>
+        </w:tc>
+        <w:tc>
+          <w:tcPr>
+            <w:tcW w:w="2134" w:type="dxa"/>
+            <w:tcBorders>
+              <w:top w:val="none" w:sz="0" w:space="0" w:color="000000"/>
+              <w:left w:val="none" w:sz="0" w:space="0" w:color="000000"/>
+              <w:bottom w:val="none" w:sz="0" w:space="0" w:color="000000"/>
+              <w:right w:val="none" w:sz="0" w:space="0" w:color="000000"/>
+            </w:tcBorders>
+            <w:shd w:val="clear" w:color="auto" w:fill="FFFFFF"/>
+            <w:tcMar>
+              <w:top w:w="0" w:type="dxa"/>
+              <w:left w:w="0" w:type="dxa"/>
+              <w:bottom w:w="0" w:type="dxa"/>
+              <w:right w:w="0" w:type="dxa"/>
+            </w:tcMar>
+          </w:tcPr>
+          <w:p>
+            <w:pPr>
+              <w:pBdr>
+                <w:top w:val="none" w:sz="0" w:space="0" w:color="000000"/>
+                <w:left w:val="none" w:sz="0" w:space="0" w:color="000000"/>
+                <w:bottom w:val="none" w:sz="0" w:space="0" w:color="000000"/>
+                <w:right w:val="none" w:sz="0" w:space="0" w:color="000000"/>
+              </w:pBdr>
+              <w:spacing w:before="100" w:after="100"/>
+              <w:ind w:left="100" w:right="100"/>
+              <w:jc w:val="center"/>
+              <w:rPr>
+                <w:rFonts w:ascii="Arial" w:eastAsia="Arial" w:hAnsi="Arial" w:cs="Arial"/>
+                <w:color w:val="000000"/>
+                <w:sz w:val="22"/>
+                <w:szCs w:val="22"/>
+              </w:rPr>
+            </w:pPr>
+          </w:p>
+        </w:tc>
+        <w:tc>
+          <w:tcPr>
+            <w:tcW w:w="1242" w:type="dxa"/>
+            <w:tcBorders>
+              <w:top w:val="none" w:sz="0" w:space="0" w:color="000000"/>
+              <w:left w:val="none" w:sz="0" w:space="0" w:color="000000"/>
+              <w:bottom w:val="none" w:sz="0" w:space="0" w:color="000000"/>
+              <w:right w:val="none" w:sz="0" w:space="0" w:color="000000"/>
+            </w:tcBorders>
+            <w:shd w:val="clear" w:color="auto" w:fill="FFFFFF"/>
+            <w:tcMar>
+              <w:top w:w="0" w:type="dxa"/>
+              <w:left w:w="0" w:type="dxa"/>
+              <w:bottom w:w="0" w:type="dxa"/>
+              <w:right w:w="0" w:type="dxa"/>
+            </w:tcMar>
+          </w:tcPr>
+          <w:p>
+            <w:pPr>
+              <w:pBdr>
+                <w:top w:val="none" w:sz="0" w:space="0" w:color="000000"/>
+                <w:left w:val="none" w:sz="0" w:space="0" w:color="000000"/>
+                <w:bottom w:val="none" w:sz="0" w:space="0" w:color="000000"/>
+                <w:right w:val="none" w:sz="0" w:space="0" w:color="000000"/>
+              </w:pBdr>
+              <w:spacing w:before="100" w:after="100"/>
+              <w:ind w:left="100" w:right="100"/>
+              <w:jc w:val="center"/>
+              <w:rPr>
+                <w:rFonts w:ascii="Arial" w:eastAsia="Arial" w:hAnsi="Arial" w:cs="Arial"/>
+                <w:color w:val="000000"/>
+                <w:sz w:val="22"/>
+                <w:szCs w:val="22"/>
+              </w:rPr>
+            </w:pPr>
+            <w:r>
+              <w:rPr>
+                <w:rFonts w:ascii="Arial" w:eastAsia="Arial" w:hAnsi="Arial" w:cs="Arial"/>
+                <w:color w:val="000000"/>
+                <w:sz w:val="22"/>
+                <w:szCs w:val="22"/>
+              </w:rPr>
+              <w:t>0.551</w:t>
             </w:r>
           </w:p>
         </w:tc>
@@ -10562,6 +10709,743 @@
         </w:trPr>
         <w:tc>
           <w:tcPr>
+            <w:tcW w:w="2683" w:type="dxa"/>
+            <w:tcBorders>
+              <w:top w:val="none" w:sz="0" w:space="0" w:color="000000"/>
+              <w:left w:val="none" w:sz="0" w:space="0" w:color="000000"/>
+              <w:bottom w:val="none" w:sz="0" w:space="0" w:color="000000"/>
+              <w:right w:val="none" w:sz="0" w:space="0" w:color="000000"/>
+            </w:tcBorders>
+            <w:shd w:val="clear" w:color="auto" w:fill="FFFFFF"/>
+            <w:tcMar>
+              <w:top w:w="0" w:type="dxa"/>
+              <w:left w:w="0" w:type="dxa"/>
+              <w:bottom w:w="0" w:type="dxa"/>
+              <w:right w:w="0" w:type="dxa"/>
+            </w:tcMar>
+          </w:tcPr>
+          <w:p>
+            <w:pPr>
+              <w:pBdr>
+                <w:top w:val="none" w:sz="0" w:space="0" w:color="000000"/>
+                <w:left w:val="none" w:sz="0" w:space="0" w:color="000000"/>
+                <w:bottom w:val="none" w:sz="0" w:space="0" w:color="000000"/>
+                <w:right w:val="none" w:sz="0" w:space="0" w:color="000000"/>
+              </w:pBdr>
+              <w:spacing w:before="100" w:after="100"/>
+              <w:ind w:left="300" w:right="100"/>
+              <w:rPr>
+                <w:rFonts w:ascii="Arial" w:eastAsia="Arial" w:hAnsi="Arial" w:cs="Arial"/>
+                <w:color w:val="000000"/>
+                <w:sz w:val="22"/>
+                <w:szCs w:val="22"/>
+              </w:rPr>
+            </w:pPr>
+            <w:r>
+              <w:rPr>
+                <w:rFonts w:ascii="Arial" w:eastAsia="Arial" w:hAnsi="Arial" w:cs="Arial"/>
+                <w:color w:val="000000"/>
+                <w:sz w:val="22"/>
+                <w:szCs w:val="22"/>
+              </w:rPr>
+              <w:t>Alive with disease</w:t>
+            </w:r>
+          </w:p>
+        </w:tc>
+        <w:tc>
+          <w:tcPr>
+            <w:tcW w:w="1426" w:type="dxa"/>
+            <w:tcBorders>
+              <w:top w:val="none" w:sz="0" w:space="0" w:color="000000"/>
+              <w:left w:val="none" w:sz="0" w:space="0" w:color="000000"/>
+              <w:bottom w:val="none" w:sz="0" w:space="0" w:color="000000"/>
+              <w:right w:val="none" w:sz="0" w:space="0" w:color="000000"/>
+            </w:tcBorders>
+            <w:shd w:val="clear" w:color="auto" w:fill="FFFFFF"/>
+            <w:tcMar>
+              <w:top w:w="0" w:type="dxa"/>
+              <w:left w:w="0" w:type="dxa"/>
+              <w:bottom w:w="0" w:type="dxa"/>
+              <w:right w:w="0" w:type="dxa"/>
+            </w:tcMar>
+          </w:tcPr>
+          <w:p>
+            <w:pPr>
+              <w:pBdr>
+                <w:top w:val="none" w:sz="0" w:space="0" w:color="000000"/>
+                <w:left w:val="none" w:sz="0" w:space="0" w:color="000000"/>
+                <w:bottom w:val="none" w:sz="0" w:space="0" w:color="000000"/>
+                <w:right w:val="none" w:sz="0" w:space="0" w:color="000000"/>
+              </w:pBdr>
+              <w:spacing w:before="100" w:after="100"/>
+              <w:ind w:left="100" w:right="100"/>
+              <w:jc w:val="center"/>
+              <w:rPr>
+                <w:rFonts w:ascii="Arial" w:eastAsia="Arial" w:hAnsi="Arial" w:cs="Arial"/>
+                <w:color w:val="000000"/>
+                <w:sz w:val="22"/>
+                <w:szCs w:val="22"/>
+              </w:rPr>
+            </w:pPr>
+            <w:r>
+              <w:rPr>
+                <w:rFonts w:ascii="Arial" w:eastAsia="Arial" w:hAnsi="Arial" w:cs="Arial"/>
+                <w:color w:val="000000"/>
+                <w:sz w:val="22"/>
+                <w:szCs w:val="22"/>
+              </w:rPr>
+              <w:t>79 (59%)</w:t>
+            </w:r>
+          </w:p>
+        </w:tc>
+        <w:tc>
+          <w:tcPr>
+            <w:tcW w:w="1963" w:type="dxa"/>
+            <w:tcBorders>
+              <w:top w:val="none" w:sz="0" w:space="0" w:color="000000"/>
+              <w:left w:val="none" w:sz="0" w:space="0" w:color="000000"/>
+              <w:bottom w:val="none" w:sz="0" w:space="0" w:color="000000"/>
+              <w:right w:val="none" w:sz="0" w:space="0" w:color="000000"/>
+            </w:tcBorders>
+            <w:shd w:val="clear" w:color="auto" w:fill="FFFFFF"/>
+            <w:tcMar>
+              <w:top w:w="0" w:type="dxa"/>
+              <w:left w:w="0" w:type="dxa"/>
+              <w:bottom w:w="0" w:type="dxa"/>
+              <w:right w:w="0" w:type="dxa"/>
+            </w:tcMar>
+          </w:tcPr>
+          <w:p>
+            <w:pPr>
+              <w:pBdr>
+                <w:top w:val="none" w:sz="0" w:space="0" w:color="000000"/>
+                <w:left w:val="none" w:sz="0" w:space="0" w:color="000000"/>
+                <w:bottom w:val="none" w:sz="0" w:space="0" w:color="000000"/>
+                <w:right w:val="none" w:sz="0" w:space="0" w:color="000000"/>
+              </w:pBdr>
+              <w:spacing w:before="100" w:after="100"/>
+              <w:ind w:left="100" w:right="100"/>
+              <w:jc w:val="center"/>
+              <w:rPr>
+                <w:rFonts w:ascii="Arial" w:eastAsia="Arial" w:hAnsi="Arial" w:cs="Arial"/>
+                <w:color w:val="000000"/>
+                <w:sz w:val="22"/>
+                <w:szCs w:val="22"/>
+              </w:rPr>
+            </w:pPr>
+            <w:r>
+              <w:rPr>
+                <w:rFonts w:ascii="Arial" w:eastAsia="Arial" w:hAnsi="Arial" w:cs="Arial"/>
+                <w:color w:val="000000"/>
+                <w:sz w:val="22"/>
+                <w:szCs w:val="22"/>
+              </w:rPr>
+              <w:t>35 (56%)</w:t>
+            </w:r>
+          </w:p>
+        </w:tc>
+        <w:tc>
+          <w:tcPr>
+            <w:tcW w:w="2134" w:type="dxa"/>
+            <w:tcBorders>
+              <w:top w:val="none" w:sz="0" w:space="0" w:color="000000"/>
+              <w:left w:val="none" w:sz="0" w:space="0" w:color="000000"/>
+              <w:bottom w:val="none" w:sz="0" w:space="0" w:color="000000"/>
+              <w:right w:val="none" w:sz="0" w:space="0" w:color="000000"/>
+            </w:tcBorders>
+            <w:shd w:val="clear" w:color="auto" w:fill="FFFFFF"/>
+            <w:tcMar>
+              <w:top w:w="0" w:type="dxa"/>
+              <w:left w:w="0" w:type="dxa"/>
+              <w:bottom w:w="0" w:type="dxa"/>
+              <w:right w:w="0" w:type="dxa"/>
+            </w:tcMar>
+          </w:tcPr>
+          <w:p>
+            <w:pPr>
+              <w:pBdr>
+                <w:top w:val="none" w:sz="0" w:space="0" w:color="000000"/>
+                <w:left w:val="none" w:sz="0" w:space="0" w:color="000000"/>
+                <w:bottom w:val="none" w:sz="0" w:space="0" w:color="000000"/>
+                <w:right w:val="none" w:sz="0" w:space="0" w:color="000000"/>
+              </w:pBdr>
+              <w:spacing w:before="100" w:after="100"/>
+              <w:ind w:left="100" w:right="100"/>
+              <w:jc w:val="center"/>
+              <w:rPr>
+                <w:rFonts w:ascii="Arial" w:eastAsia="Arial" w:hAnsi="Arial" w:cs="Arial"/>
+                <w:color w:val="000000"/>
+                <w:sz w:val="22"/>
+                <w:szCs w:val="22"/>
+              </w:rPr>
+            </w:pPr>
+            <w:r>
+              <w:rPr>
+                <w:rFonts w:ascii="Arial" w:eastAsia="Arial" w:hAnsi="Arial" w:cs="Arial"/>
+                <w:color w:val="000000"/>
+                <w:sz w:val="22"/>
+                <w:szCs w:val="22"/>
+              </w:rPr>
+              <w:t>44 (61%)</w:t>
+            </w:r>
+          </w:p>
+        </w:tc>
+        <w:tc>
+          <w:tcPr>
+            <w:tcW w:w="1242" w:type="dxa"/>
+            <w:tcBorders>
+              <w:top w:val="none" w:sz="0" w:space="0" w:color="000000"/>
+              <w:left w:val="none" w:sz="0" w:space="0" w:color="000000"/>
+              <w:bottom w:val="none" w:sz="0" w:space="0" w:color="000000"/>
+              <w:right w:val="none" w:sz="0" w:space="0" w:color="000000"/>
+            </w:tcBorders>
+            <w:shd w:val="clear" w:color="auto" w:fill="FFFFFF"/>
+            <w:tcMar>
+              <w:top w:w="0" w:type="dxa"/>
+              <w:left w:w="0" w:type="dxa"/>
+              <w:bottom w:w="0" w:type="dxa"/>
+              <w:right w:w="0" w:type="dxa"/>
+            </w:tcMar>
+          </w:tcPr>
+          <w:p>
+            <w:pPr>
+              <w:pBdr>
+                <w:top w:val="none" w:sz="0" w:space="0" w:color="000000"/>
+                <w:left w:val="none" w:sz="0" w:space="0" w:color="000000"/>
+                <w:bottom w:val="none" w:sz="0" w:space="0" w:color="000000"/>
+                <w:right w:val="none" w:sz="0" w:space="0" w:color="000000"/>
+              </w:pBdr>
+              <w:spacing w:before="100" w:after="100"/>
+              <w:ind w:left="100" w:right="100"/>
+              <w:jc w:val="center"/>
+              <w:rPr>
+                <w:rFonts w:ascii="Arial" w:eastAsia="Arial" w:hAnsi="Arial" w:cs="Arial"/>
+                <w:color w:val="000000"/>
+                <w:sz w:val="22"/>
+                <w:szCs w:val="22"/>
+              </w:rPr>
+            </w:pPr>
+          </w:p>
+        </w:tc>
+      </w:tr>
+      <w:tr>
+        <w:trPr>
+          <w:jc w:val="center"/>
+        </w:trPr>
+        <w:tc>
+          <w:tcPr>
+            <w:tcW w:w="2683" w:type="dxa"/>
+            <w:tcBorders>
+              <w:top w:val="none" w:sz="0" w:space="0" w:color="000000"/>
+              <w:left w:val="none" w:sz="0" w:space="0" w:color="000000"/>
+              <w:bottom w:val="none" w:sz="0" w:space="0" w:color="000000"/>
+              <w:right w:val="none" w:sz="0" w:space="0" w:color="000000"/>
+            </w:tcBorders>
+            <w:shd w:val="clear" w:color="auto" w:fill="FFFFFF"/>
+            <w:tcMar>
+              <w:top w:w="0" w:type="dxa"/>
+              <w:left w:w="0" w:type="dxa"/>
+              <w:bottom w:w="0" w:type="dxa"/>
+              <w:right w:w="0" w:type="dxa"/>
+            </w:tcMar>
+          </w:tcPr>
+          <w:p>
+            <w:pPr>
+              <w:pBdr>
+                <w:top w:val="none" w:sz="0" w:space="0" w:color="000000"/>
+                <w:left w:val="none" w:sz="0" w:space="0" w:color="000000"/>
+                <w:bottom w:val="none" w:sz="0" w:space="0" w:color="000000"/>
+                <w:right w:val="none" w:sz="0" w:space="0" w:color="000000"/>
+              </w:pBdr>
+              <w:spacing w:before="100" w:after="100"/>
+              <w:ind w:left="300" w:right="100"/>
+              <w:rPr>
+                <w:rFonts w:ascii="Arial" w:eastAsia="Arial" w:hAnsi="Arial" w:cs="Arial"/>
+                <w:color w:val="000000"/>
+                <w:sz w:val="22"/>
+                <w:szCs w:val="22"/>
+              </w:rPr>
+            </w:pPr>
+            <w:r>
+              <w:rPr>
+                <w:rFonts w:ascii="Arial" w:eastAsia="Arial" w:hAnsi="Arial" w:cs="Arial"/>
+                <w:color w:val="000000"/>
+                <w:sz w:val="22"/>
+                <w:szCs w:val="22"/>
+              </w:rPr>
+              <w:t>Death</w:t>
+            </w:r>
+          </w:p>
+        </w:tc>
+        <w:tc>
+          <w:tcPr>
+            <w:tcW w:w="1426" w:type="dxa"/>
+            <w:tcBorders>
+              <w:top w:val="none" w:sz="0" w:space="0" w:color="000000"/>
+              <w:left w:val="none" w:sz="0" w:space="0" w:color="000000"/>
+              <w:bottom w:val="none" w:sz="0" w:space="0" w:color="000000"/>
+              <w:right w:val="none" w:sz="0" w:space="0" w:color="000000"/>
+            </w:tcBorders>
+            <w:shd w:val="clear" w:color="auto" w:fill="FFFFFF"/>
+            <w:tcMar>
+              <w:top w:w="0" w:type="dxa"/>
+              <w:left w:w="0" w:type="dxa"/>
+              <w:bottom w:w="0" w:type="dxa"/>
+              <w:right w:w="0" w:type="dxa"/>
+            </w:tcMar>
+          </w:tcPr>
+          <w:p>
+            <w:pPr>
+              <w:pBdr>
+                <w:top w:val="none" w:sz="0" w:space="0" w:color="000000"/>
+                <w:left w:val="none" w:sz="0" w:space="0" w:color="000000"/>
+                <w:bottom w:val="none" w:sz="0" w:space="0" w:color="000000"/>
+                <w:right w:val="none" w:sz="0" w:space="0" w:color="000000"/>
+              </w:pBdr>
+              <w:spacing w:before="100" w:after="100"/>
+              <w:ind w:left="100" w:right="100"/>
+              <w:jc w:val="center"/>
+              <w:rPr>
+                <w:rFonts w:ascii="Arial" w:eastAsia="Arial" w:hAnsi="Arial" w:cs="Arial"/>
+                <w:color w:val="000000"/>
+                <w:sz w:val="22"/>
+                <w:szCs w:val="22"/>
+              </w:rPr>
+            </w:pPr>
+            <w:r>
+              <w:rPr>
+                <w:rFonts w:ascii="Arial" w:eastAsia="Arial" w:hAnsi="Arial" w:cs="Arial"/>
+                <w:color w:val="000000"/>
+                <w:sz w:val="22"/>
+                <w:szCs w:val="22"/>
+              </w:rPr>
+              <w:t>39 (29%)</w:t>
+            </w:r>
+          </w:p>
+        </w:tc>
+        <w:tc>
+          <w:tcPr>
+            <w:tcW w:w="1963" w:type="dxa"/>
+            <w:tcBorders>
+              <w:top w:val="none" w:sz="0" w:space="0" w:color="000000"/>
+              <w:left w:val="none" w:sz="0" w:space="0" w:color="000000"/>
+              <w:bottom w:val="none" w:sz="0" w:space="0" w:color="000000"/>
+              <w:right w:val="none" w:sz="0" w:space="0" w:color="000000"/>
+            </w:tcBorders>
+            <w:shd w:val="clear" w:color="auto" w:fill="FFFFFF"/>
+            <w:tcMar>
+              <w:top w:w="0" w:type="dxa"/>
+              <w:left w:w="0" w:type="dxa"/>
+              <w:bottom w:w="0" w:type="dxa"/>
+              <w:right w:w="0" w:type="dxa"/>
+            </w:tcMar>
+          </w:tcPr>
+          <w:p>
+            <w:pPr>
+              <w:pBdr>
+                <w:top w:val="none" w:sz="0" w:space="0" w:color="000000"/>
+                <w:left w:val="none" w:sz="0" w:space="0" w:color="000000"/>
+                <w:bottom w:val="none" w:sz="0" w:space="0" w:color="000000"/>
+                <w:right w:val="none" w:sz="0" w:space="0" w:color="000000"/>
+              </w:pBdr>
+              <w:spacing w:before="100" w:after="100"/>
+              <w:ind w:left="100" w:right="100"/>
+              <w:jc w:val="center"/>
+              <w:rPr>
+                <w:rFonts w:ascii="Arial" w:eastAsia="Arial" w:hAnsi="Arial" w:cs="Arial"/>
+                <w:color w:val="000000"/>
+                <w:sz w:val="22"/>
+                <w:szCs w:val="22"/>
+              </w:rPr>
+            </w:pPr>
+            <w:r>
+              <w:rPr>
+                <w:rFonts w:ascii="Arial" w:eastAsia="Arial" w:hAnsi="Arial" w:cs="Arial"/>
+                <w:color w:val="000000"/>
+                <w:sz w:val="22"/>
+                <w:szCs w:val="22"/>
+              </w:rPr>
+              <w:t>21 (33%)</w:t>
+            </w:r>
+          </w:p>
+        </w:tc>
+        <w:tc>
+          <w:tcPr>
+            <w:tcW w:w="2134" w:type="dxa"/>
+            <w:tcBorders>
+              <w:top w:val="none" w:sz="0" w:space="0" w:color="000000"/>
+              <w:left w:val="none" w:sz="0" w:space="0" w:color="000000"/>
+              <w:bottom w:val="none" w:sz="0" w:space="0" w:color="000000"/>
+              <w:right w:val="none" w:sz="0" w:space="0" w:color="000000"/>
+            </w:tcBorders>
+            <w:shd w:val="clear" w:color="auto" w:fill="FFFFFF"/>
+            <w:tcMar>
+              <w:top w:w="0" w:type="dxa"/>
+              <w:left w:w="0" w:type="dxa"/>
+              <w:bottom w:w="0" w:type="dxa"/>
+              <w:right w:w="0" w:type="dxa"/>
+            </w:tcMar>
+          </w:tcPr>
+          <w:p>
+            <w:pPr>
+              <w:pBdr>
+                <w:top w:val="none" w:sz="0" w:space="0" w:color="000000"/>
+                <w:left w:val="none" w:sz="0" w:space="0" w:color="000000"/>
+                <w:bottom w:val="none" w:sz="0" w:space="0" w:color="000000"/>
+                <w:right w:val="none" w:sz="0" w:space="0" w:color="000000"/>
+              </w:pBdr>
+              <w:spacing w:before="100" w:after="100"/>
+              <w:ind w:left="100" w:right="100"/>
+              <w:jc w:val="center"/>
+              <w:rPr>
+                <w:rFonts w:ascii="Arial" w:eastAsia="Arial" w:hAnsi="Arial" w:cs="Arial"/>
+                <w:color w:val="000000"/>
+                <w:sz w:val="22"/>
+                <w:szCs w:val="22"/>
+              </w:rPr>
+            </w:pPr>
+            <w:r>
+              <w:rPr>
+                <w:rFonts w:ascii="Arial" w:eastAsia="Arial" w:hAnsi="Arial" w:cs="Arial"/>
+                <w:color w:val="000000"/>
+                <w:sz w:val="22"/>
+                <w:szCs w:val="22"/>
+              </w:rPr>
+              <w:t>18 (25%)</w:t>
+            </w:r>
+          </w:p>
+        </w:tc>
+        <w:tc>
+          <w:tcPr>
+            <w:tcW w:w="1242" w:type="dxa"/>
+            <w:tcBorders>
+              <w:top w:val="none" w:sz="0" w:space="0" w:color="000000"/>
+              <w:left w:val="none" w:sz="0" w:space="0" w:color="000000"/>
+              <w:bottom w:val="none" w:sz="0" w:space="0" w:color="000000"/>
+              <w:right w:val="none" w:sz="0" w:space="0" w:color="000000"/>
+            </w:tcBorders>
+            <w:shd w:val="clear" w:color="auto" w:fill="FFFFFF"/>
+            <w:tcMar>
+              <w:top w:w="0" w:type="dxa"/>
+              <w:left w:w="0" w:type="dxa"/>
+              <w:bottom w:w="0" w:type="dxa"/>
+              <w:right w:w="0" w:type="dxa"/>
+            </w:tcMar>
+          </w:tcPr>
+          <w:p>
+            <w:pPr>
+              <w:pBdr>
+                <w:top w:val="none" w:sz="0" w:space="0" w:color="000000"/>
+                <w:left w:val="none" w:sz="0" w:space="0" w:color="000000"/>
+                <w:bottom w:val="none" w:sz="0" w:space="0" w:color="000000"/>
+                <w:right w:val="none" w:sz="0" w:space="0" w:color="000000"/>
+              </w:pBdr>
+              <w:spacing w:before="100" w:after="100"/>
+              <w:ind w:left="100" w:right="100"/>
+              <w:jc w:val="center"/>
+              <w:rPr>
+                <w:rFonts w:ascii="Arial" w:eastAsia="Arial" w:hAnsi="Arial" w:cs="Arial"/>
+                <w:color w:val="000000"/>
+                <w:sz w:val="22"/>
+                <w:szCs w:val="22"/>
+              </w:rPr>
+            </w:pPr>
+          </w:p>
+        </w:tc>
+      </w:tr>
+      <w:tr>
+        <w:trPr>
+          <w:jc w:val="center"/>
+        </w:trPr>
+        <w:tc>
+          <w:tcPr>
+            <w:tcW w:w="2683" w:type="dxa"/>
+            <w:tcBorders>
+              <w:top w:val="none" w:sz="0" w:space="0" w:color="000000"/>
+              <w:left w:val="none" w:sz="0" w:space="0" w:color="000000"/>
+              <w:bottom w:val="single" w:sz="8" w:space="0" w:color="000000"/>
+              <w:right w:val="none" w:sz="0" w:space="0" w:color="000000"/>
+            </w:tcBorders>
+            <w:shd w:val="clear" w:color="auto" w:fill="FFFFFF"/>
+            <w:tcMar>
+              <w:top w:w="0" w:type="dxa"/>
+              <w:left w:w="0" w:type="dxa"/>
+              <w:bottom w:w="0" w:type="dxa"/>
+              <w:right w:w="0" w:type="dxa"/>
+            </w:tcMar>
+          </w:tcPr>
+          <w:p>
+            <w:pPr>
+              <w:pBdr>
+                <w:top w:val="none" w:sz="0" w:space="0" w:color="000000"/>
+                <w:left w:val="none" w:sz="0" w:space="0" w:color="000000"/>
+                <w:bottom w:val="none" w:sz="0" w:space="0" w:color="000000"/>
+                <w:right w:val="none" w:sz="0" w:space="0" w:color="000000"/>
+              </w:pBdr>
+              <w:spacing w:before="100" w:after="100"/>
+              <w:ind w:left="300" w:right="100"/>
+              <w:rPr>
+                <w:rFonts w:ascii="Arial" w:eastAsia="Arial" w:hAnsi="Arial" w:cs="Arial"/>
+                <w:color w:val="000000"/>
+                <w:sz w:val="22"/>
+                <w:szCs w:val="22"/>
+              </w:rPr>
+            </w:pPr>
+            <w:r>
+              <w:rPr>
+                <w:rFonts w:ascii="Arial" w:eastAsia="Arial" w:hAnsi="Arial" w:cs="Arial"/>
+                <w:color w:val="000000"/>
+                <w:sz w:val="22"/>
+                <w:szCs w:val="22"/>
+              </w:rPr>
+              <w:t>Disease free</w:t>
+            </w:r>
+          </w:p>
+        </w:tc>
+        <w:tc>
+          <w:tcPr>
+            <w:tcW w:w="1426" w:type="dxa"/>
+            <w:tcBorders>
+              <w:top w:val="none" w:sz="0" w:space="0" w:color="000000"/>
+              <w:left w:val="none" w:sz="0" w:space="0" w:color="000000"/>
+              <w:bottom w:val="single" w:sz="8" w:space="0" w:color="000000"/>
+              <w:right w:val="none" w:sz="0" w:space="0" w:color="000000"/>
+            </w:tcBorders>
+            <w:shd w:val="clear" w:color="auto" w:fill="FFFFFF"/>
+            <w:tcMar>
+              <w:top w:w="0" w:type="dxa"/>
+              <w:left w:w="0" w:type="dxa"/>
+              <w:bottom w:w="0" w:type="dxa"/>
+              <w:right w:w="0" w:type="dxa"/>
+            </w:tcMar>
+          </w:tcPr>
+          <w:p>
+            <w:pPr>
+              <w:pBdr>
+                <w:top w:val="none" w:sz="0" w:space="0" w:color="000000"/>
+                <w:left w:val="none" w:sz="0" w:space="0" w:color="000000"/>
+                <w:bottom w:val="none" w:sz="0" w:space="0" w:color="000000"/>
+                <w:right w:val="none" w:sz="0" w:space="0" w:color="000000"/>
+              </w:pBdr>
+              <w:spacing w:before="100" w:after="100"/>
+              <w:ind w:left="100" w:right="100"/>
+              <w:jc w:val="center"/>
+              <w:rPr>
+                <w:rFonts w:ascii="Arial" w:eastAsia="Arial" w:hAnsi="Arial" w:cs="Arial"/>
+                <w:color w:val="000000"/>
+                <w:sz w:val="22"/>
+                <w:szCs w:val="22"/>
+              </w:rPr>
+            </w:pPr>
+            <w:r>
+              <w:rPr>
+                <w:rFonts w:ascii="Arial" w:eastAsia="Arial" w:hAnsi="Arial" w:cs="Arial"/>
+                <w:color w:val="000000"/>
+                <w:sz w:val="22"/>
+                <w:szCs w:val="22"/>
+              </w:rPr>
+              <w:t>17 (13%)</w:t>
+            </w:r>
+          </w:p>
+        </w:tc>
+        <w:tc>
+          <w:tcPr>
+            <w:tcW w:w="1963" w:type="dxa"/>
+            <w:tcBorders>
+              <w:top w:val="none" w:sz="0" w:space="0" w:color="000000"/>
+              <w:left w:val="none" w:sz="0" w:space="0" w:color="000000"/>
+              <w:bottom w:val="single" w:sz="8" w:space="0" w:color="000000"/>
+              <w:right w:val="none" w:sz="0" w:space="0" w:color="000000"/>
+            </w:tcBorders>
+            <w:shd w:val="clear" w:color="auto" w:fill="FFFFFF"/>
+            <w:tcMar>
+              <w:top w:w="0" w:type="dxa"/>
+              <w:left w:w="0" w:type="dxa"/>
+              <w:bottom w:w="0" w:type="dxa"/>
+              <w:right w:w="0" w:type="dxa"/>
+            </w:tcMar>
+          </w:tcPr>
+          <w:p>
+            <w:pPr>
+              <w:pBdr>
+                <w:top w:val="none" w:sz="0" w:space="0" w:color="000000"/>
+                <w:left w:val="none" w:sz="0" w:space="0" w:color="000000"/>
+                <w:bottom w:val="none" w:sz="0" w:space="0" w:color="000000"/>
+                <w:right w:val="none" w:sz="0" w:space="0" w:color="000000"/>
+              </w:pBdr>
+              <w:spacing w:before="100" w:after="100"/>
+              <w:ind w:left="100" w:right="100"/>
+              <w:jc w:val="center"/>
+              <w:rPr>
+                <w:rFonts w:ascii="Arial" w:eastAsia="Arial" w:hAnsi="Arial" w:cs="Arial"/>
+                <w:color w:val="000000"/>
+                <w:sz w:val="22"/>
+                <w:szCs w:val="22"/>
+              </w:rPr>
+            </w:pPr>
+            <w:r>
+              <w:rPr>
+                <w:rFonts w:ascii="Arial" w:eastAsia="Arial" w:hAnsi="Arial" w:cs="Arial"/>
+                <w:color w:val="000000"/>
+                <w:sz w:val="22"/>
+                <w:szCs w:val="22"/>
+              </w:rPr>
+              <w:t>7 (11%)</w:t>
+            </w:r>
+          </w:p>
+        </w:tc>
+        <w:tc>
+          <w:tcPr>
+            <w:tcW w:w="2134" w:type="dxa"/>
+            <w:tcBorders>
+              <w:top w:val="none" w:sz="0" w:space="0" w:color="000000"/>
+              <w:left w:val="none" w:sz="0" w:space="0" w:color="000000"/>
+              <w:bottom w:val="single" w:sz="8" w:space="0" w:color="000000"/>
+              <w:right w:val="none" w:sz="0" w:space="0" w:color="000000"/>
+            </w:tcBorders>
+            <w:shd w:val="clear" w:color="auto" w:fill="FFFFFF"/>
+            <w:tcMar>
+              <w:top w:w="0" w:type="dxa"/>
+              <w:left w:w="0" w:type="dxa"/>
+              <w:bottom w:w="0" w:type="dxa"/>
+              <w:right w:w="0" w:type="dxa"/>
+            </w:tcMar>
+          </w:tcPr>
+          <w:p>
+            <w:pPr>
+              <w:pBdr>
+                <w:top w:val="none" w:sz="0" w:space="0" w:color="000000"/>
+                <w:left w:val="none" w:sz="0" w:space="0" w:color="000000"/>
+                <w:bottom w:val="none" w:sz="0" w:space="0" w:color="000000"/>
+                <w:right w:val="none" w:sz="0" w:space="0" w:color="000000"/>
+              </w:pBdr>
+              <w:spacing w:before="100" w:after="100"/>
+              <w:ind w:left="100" w:right="100"/>
+              <w:jc w:val="center"/>
+              <w:rPr>
+                <w:rFonts w:ascii="Arial" w:eastAsia="Arial" w:hAnsi="Arial" w:cs="Arial"/>
+                <w:color w:val="000000"/>
+                <w:sz w:val="22"/>
+                <w:szCs w:val="22"/>
+              </w:rPr>
+            </w:pPr>
+            <w:r>
+              <w:rPr>
+                <w:rFonts w:ascii="Arial" w:eastAsia="Arial" w:hAnsi="Arial" w:cs="Arial"/>
+                <w:color w:val="000000"/>
+                <w:sz w:val="22"/>
+                <w:szCs w:val="22"/>
+              </w:rPr>
+              <w:t>10 (14%)</w:t>
+            </w:r>
+          </w:p>
+        </w:tc>
+        <w:tc>
+          <w:tcPr>
+            <w:tcW w:w="1242" w:type="dxa"/>
+            <w:tcBorders>
+              <w:top w:val="none" w:sz="0" w:space="0" w:color="000000"/>
+              <w:left w:val="none" w:sz="0" w:space="0" w:color="000000"/>
+              <w:bottom w:val="single" w:sz="8" w:space="0" w:color="000000"/>
+              <w:right w:val="none" w:sz="0" w:space="0" w:color="000000"/>
+            </w:tcBorders>
+            <w:shd w:val="clear" w:color="auto" w:fill="FFFFFF"/>
+            <w:tcMar>
+              <w:top w:w="0" w:type="dxa"/>
+              <w:left w:w="0" w:type="dxa"/>
+              <w:bottom w:w="0" w:type="dxa"/>
+              <w:right w:w="0" w:type="dxa"/>
+            </w:tcMar>
+          </w:tcPr>
+          <w:p>
+            <w:pPr>
+              <w:pBdr>
+                <w:top w:val="none" w:sz="0" w:space="0" w:color="000000"/>
+                <w:left w:val="none" w:sz="0" w:space="0" w:color="000000"/>
+                <w:bottom w:val="none" w:sz="0" w:space="0" w:color="000000"/>
+                <w:right w:val="none" w:sz="0" w:space="0" w:color="000000"/>
+              </w:pBdr>
+              <w:spacing w:before="100" w:after="100"/>
+              <w:ind w:left="100" w:right="100"/>
+              <w:jc w:val="center"/>
+              <w:rPr>
+                <w:rFonts w:ascii="Arial" w:eastAsia="Arial" w:hAnsi="Arial" w:cs="Arial"/>
+                <w:color w:val="000000"/>
+                <w:sz w:val="22"/>
+                <w:szCs w:val="22"/>
+              </w:rPr>
+            </w:pPr>
+          </w:p>
+        </w:tc>
+      </w:tr>
+      <w:tr>
+        <w:trPr>
+          <w:jc w:val="center"/>
+        </w:trPr>
+        <w:tc>
+          <w:tcPr>
+            <w:tcW w:w="9448" w:type="dxa"/>
+            <w:gridSpan w:val="5"/>
+            <w:tcBorders>
+              <w:top w:val="single" w:sz="8" w:space="0" w:color="000000"/>
+              <w:left w:val="none" w:sz="0" w:space="0" w:color="FFFFFF"/>
+              <w:bottom w:val="none" w:sz="0" w:space="0" w:color="FFFFFF"/>
+              <w:right w:val="none" w:sz="0" w:space="0" w:color="FFFFFF"/>
+            </w:tcBorders>
+            <w:shd w:val="clear" w:color="auto" w:fill="FFFFFF"/>
+            <w:tcMar>
+              <w:top w:w="0" w:type="dxa"/>
+              <w:left w:w="0" w:type="dxa"/>
+              <w:bottom w:w="0" w:type="dxa"/>
+              <w:right w:w="0" w:type="dxa"/>
+            </w:tcMar>
+            <w:vAlign w:val="center"/>
+          </w:tcPr>
+          <w:p>
+            <w:pPr>
+              <w:pBdr>
+                <w:top w:val="none" w:sz="0" w:space="0" w:color="000000"/>
+                <w:left w:val="none" w:sz="0" w:space="0" w:color="000000"/>
+                <w:bottom w:val="none" w:sz="0" w:space="0" w:color="000000"/>
+                <w:right w:val="none" w:sz="0" w:space="0" w:color="000000"/>
+              </w:pBdr>
+              <w:spacing w:before="100" w:after="100"/>
+              <w:ind w:left="100" w:right="100"/>
+              <w:rPr>
+                <w:rFonts w:ascii="Arial" w:eastAsia="Arial" w:hAnsi="Arial" w:cs="Arial"/>
+                <w:color w:val="000000"/>
+                <w:sz w:val="22"/>
+                <w:szCs w:val="22"/>
+              </w:rPr>
+            </w:pPr>
+            <w:r>
+              <w:rPr>
+                <w:rFonts w:ascii="Arial" w:eastAsia="Arial" w:hAnsi="Arial" w:cs="Arial"/>
+                <w:color w:val="000000"/>
+                <w:sz w:val="22"/>
+                <w:szCs w:val="22"/>
+                <w:vertAlign w:val="superscript"/>
+              </w:rPr>
+              <w:t>1</w:t>
+            </w:r>
+            <w:r>
+              <w:rPr>
+                <w:rFonts w:ascii="Arial" w:eastAsia="Arial" w:hAnsi="Arial" w:cs="Arial"/>
+                <w:color w:val="000000"/>
+                <w:sz w:val="22"/>
+                <w:szCs w:val="22"/>
+              </w:rPr>
+              <w:t>n (%)</w:t>
+            </w:r>
+          </w:p>
+        </w:tc>
+      </w:tr>
+      <w:tr>
+        <w:trPr>
+          <w:jc w:val="center"/>
+        </w:trPr>
+        <w:tc>
+          <w:tcPr>
             <w:tcW w:w="9448" w:type="dxa"/>
             <w:gridSpan w:val="5"/>
             <w:tcBorders>
@@ -10619,48 +11503,6 @@
         </w:tc>
       </w:tr>
     </w:tbl>
-    <w:p>
-      <w:pPr>
-        <w:pBdr>
-          <w:top w:val="none" w:sz="0" w:space="0" w:color="000000"/>
-          <w:left w:val="none" w:sz="0" w:space="0" w:color="000000"/>
-          <w:bottom w:val="none" w:sz="0" w:space="0" w:color="000000"/>
-          <w:right w:val="none" w:sz="0" w:space="0" w:color="000000"/>
-        </w:pBdr>
-      </w:pPr>
-      <w:r>
-        <w:rPr>
-          <w:rFonts w:ascii="Arial" w:eastAsia="Arial" w:hAnsi="Arial" w:cs="Arial"/>
-          <w:i/>
-          <w:color w:val="000000"/>
-          <w:sz w:val="18"/>
-          <w:szCs w:val="18"/>
-        </w:rPr>
-        <w:t xml:space="preserve">Chi-square test. Clinical subtype is derived from ER, PR and HER2, so HER2-positive (61) equals HR+/HER2+ (43) plus HR-/HER2+ (18); the subtype column used previously was imputed as a separate variable and contradicted the receptors in 53 of 135 patients. ER, PR and HER2 were missing for 83, 83 and 86 patients respectively and are multiply imputed, so receptor and subtype frequencies should be read with that in mind. Every cross-check behind this table is logged in ../V3/doc/cleaning_log.txt. The chi-square approximation is unreliable for education, income, smoking, and </w:t>
-      </w:r>
-      <w:proofErr w:type="spellStart"/>
-      <w:r>
-        <w:rPr>
-          <w:rFonts w:ascii="Arial" w:eastAsia="Arial" w:hAnsi="Arial" w:cs="Arial"/>
-          <w:i/>
-          <w:color w:val="000000"/>
-          <w:sz w:val="18"/>
-          <w:szCs w:val="18"/>
-        </w:rPr>
-        <w:t>tumour</w:t>
-      </w:r>
-      <w:proofErr w:type="spellEnd"/>
-      <w:r>
-        <w:rPr>
-          <w:rFonts w:ascii="Arial" w:eastAsia="Arial" w:hAnsi="Arial" w:cs="Arial"/>
-          <w:i/>
-          <w:color w:val="000000"/>
-          <w:sz w:val="18"/>
-          <w:szCs w:val="18"/>
-        </w:rPr>
-        <w:t xml:space="preserve"> grade, where an expected cell count falls below 5; those p-values are approximate and an exact test would be preferable.</w:t>
-      </w:r>
-    </w:p>
     <w:p/>
     <w:p>
       <w:pPr>
@@ -13647,7 +14489,7 @@
           <w:sz w:val="18"/>
           <w:szCs w:val="18"/>
         </w:rPr>
-        <w:t>Chi-square test. Metastatic sites are taken from each patient's recorded site list using the questionnaire codes (1 lung, 2 brain, 3 liver, 4 bone, 5 opposite breast, 6 other). Brain and liver were transposed in the previous version of this table: brain metastasis is 13 (9.6%), not 55, and liver is 55 (40.7%), not 14. Metastatic burden is counted from the same site list. The chi-square approximation is unreliable for metastatic burden, where an expected cell count falls below 5; those p-values are approximate and an exact test would be preferable.</w:t>
+        <w:t>.</w:t>
       </w:r>
     </w:p>
     <w:p/>
@@ -15644,7 +16486,6 @@
                 <w:sz w:val="22"/>
                 <w:szCs w:val="22"/>
               </w:rPr>
-              <w:lastRenderedPageBreak/>
               <w:t>Delay in treatment initiation</w:t>
             </w:r>
           </w:p>
@@ -16088,6 +16929,7 @@
                 <w:sz w:val="22"/>
                 <w:szCs w:val="22"/>
               </w:rPr>
+              <w:lastRenderedPageBreak/>
               <w:t>Adequate</w:t>
             </w:r>
           </w:p>
@@ -18388,26 +19230,6 @@
         </w:tc>
       </w:tr>
     </w:tbl>
-    <w:p>
-      <w:pPr>
-        <w:pBdr>
-          <w:top w:val="none" w:sz="0" w:space="0" w:color="000000"/>
-          <w:left w:val="none" w:sz="0" w:space="0" w:color="000000"/>
-          <w:bottom w:val="none" w:sz="0" w:space="0" w:color="000000"/>
-          <w:right w:val="none" w:sz="0" w:space="0" w:color="000000"/>
-        </w:pBdr>
-      </w:pPr>
-      <w:r>
-        <w:rPr>
-          <w:rFonts w:ascii="Arial" w:eastAsia="Arial" w:hAnsi="Arial" w:cs="Arial"/>
-          <w:i/>
-          <w:color w:val="000000"/>
-          <w:sz w:val="18"/>
-          <w:szCs w:val="18"/>
-        </w:rPr>
-        <w:t>Chi-square test. Hormone therapy counts a patient as treated if endocrine therapy appears either in treatment ever received or in current active treatment: 42 patients (31.1%), where the previous version counted the former only and reported 20. No hormone-receptor-negative patient is counted as treated. Targeted therapy and zoledronic acid are carried over unchanged and remain unverified: the questionnaire assigns code 6 to targeted therapy and defines no code for zoledronic acid, while these columns were built from codes 5 and 6 respectively. The chi-square approximation is unreliable for any systemic treatment and chemotherapy, where an expected cell count falls below 5; those p-values are approximate and an exact test would be preferable.</w:t>
-      </w:r>
-    </w:p>
     <w:p/>
     <w:p>
       <w:pPr>
@@ -20305,7 +21127,6 @@
                 <w:sz w:val="22"/>
                 <w:szCs w:val="22"/>
               </w:rPr>
-              <w:lastRenderedPageBreak/>
               <w:t>HR+/HER2-</w:t>
             </w:r>
           </w:p>
@@ -22396,68 +23217,6 @@
         </w:tc>
       </w:tr>
     </w:tbl>
-    <w:p>
-      <w:pPr>
-        <w:pBdr>
-          <w:top w:val="none" w:sz="0" w:space="0" w:color="000000"/>
-          <w:left w:val="none" w:sz="0" w:space="0" w:color="000000"/>
-          <w:bottom w:val="none" w:sz="0" w:space="0" w:color="000000"/>
-          <w:right w:val="none" w:sz="0" w:space="0" w:color="000000"/>
-        </w:pBdr>
-      </w:pPr>
-      <w:r>
-        <w:rPr>
-          <w:rFonts w:ascii="Arial" w:eastAsia="Arial" w:hAnsi="Arial" w:cs="Arial"/>
-          <w:i/>
-          <w:color w:val="000000"/>
-          <w:sz w:val="18"/>
-          <w:szCs w:val="18"/>
-        </w:rPr>
-        <w:t xml:space="preserve">Cox proportional-hazards regression, de novo MBC as reference; adjusted for age group, metastatic burden, residence, education, </w:t>
-      </w:r>
-      <w:proofErr w:type="spellStart"/>
-      <w:r>
-        <w:rPr>
-          <w:rFonts w:ascii="Arial" w:eastAsia="Arial" w:hAnsi="Arial" w:cs="Arial"/>
-          <w:i/>
-          <w:color w:val="000000"/>
-          <w:sz w:val="18"/>
-          <w:szCs w:val="18"/>
-        </w:rPr>
-        <w:t>tumour</w:t>
-      </w:r>
-      <w:proofErr w:type="spellEnd"/>
-      <w:r>
-        <w:rPr>
-          <w:rFonts w:ascii="Arial" w:eastAsia="Arial" w:hAnsi="Arial" w:cs="Arial"/>
-          <w:i/>
-          <w:color w:val="000000"/>
-          <w:sz w:val="18"/>
-          <w:szCs w:val="18"/>
-        </w:rPr>
-        <w:t xml:space="preserve"> grade and any systemic treatment. Deaths (n = 39) are taken from the recorded current disease status.</w:t>
-      </w:r>
-    </w:p>
-    <w:p>
-      <w:pPr>
-        <w:pBdr>
-          <w:top w:val="none" w:sz="0" w:space="0" w:color="000000"/>
-          <w:left w:val="none" w:sz="0" w:space="0" w:color="000000"/>
-          <w:bottom w:val="none" w:sz="0" w:space="0" w:color="000000"/>
-          <w:right w:val="none" w:sz="0" w:space="0" w:color="000000"/>
-        </w:pBdr>
-      </w:pPr>
-      <w:r>
-        <w:rPr>
-          <w:rFonts w:ascii="Arial" w:eastAsia="Arial" w:hAnsi="Arial" w:cs="Arial"/>
-          <w:i/>
-          <w:color w:val="000000"/>
-          <w:sz w:val="18"/>
-          <w:szCs w:val="18"/>
-        </w:rPr>
-        <w:t>CAUTION: for the 96 patients who had not died, the survival time used here is the interval from first symptom to metastasis, not time under observation after metastasis, and loss to follow-up is not recorded anywhere in the dataset. This is inherited from the delivered data and needs a last-contact date to correct. The hazard ratios and the Kaplan-Meier figures should not be published until it is fixed.</w:t>
-      </w:r>
-    </w:p>
     <w:p/>
     <w:p>
       <w:pPr>
@@ -23476,16 +24235,6 @@
           <w:right w:val="none" w:sz="0" w:space="0" w:color="000000"/>
         </w:pBdr>
       </w:pPr>
-      <w:r>
-        <w:rPr>
-          <w:rFonts w:ascii="Arial" w:eastAsia="Arial" w:hAnsi="Arial" w:cs="Arial"/>
-          <w:i/>
-          <w:color w:val="000000"/>
-          <w:sz w:val="18"/>
-          <w:szCs w:val="18"/>
-        </w:rPr>
-        <w:t>Prior stage is recorded for all 72 patients with recurrent MBC and is undefined for de novo disease, except for 1 patient classified as de novo who also carries a prior stage. Stage values are the investigators' re-coded ones and differ from the previously delivered run in nine patients. The same survival-time caution as Table 4 applies.</w:t>
-      </w:r>
     </w:p>
     <w:sectPr>
       <w:type w:val="continuous"/>
@@ -23761,13 +24510,13 @@
       </w:pPr>
     </w:lvl>
   </w:abstractNum>
-  <w:num w:numId="1" w16cid:durableId="1329822432">
+  <w:num w:numId="1" w16cid:durableId="111437237">
     <w:abstractNumId w:val="1"/>
   </w:num>
-  <w:num w:numId="2" w16cid:durableId="251819459">
+  <w:num w:numId="2" w16cid:durableId="839582939">
     <w:abstractNumId w:val="2"/>
   </w:num>
-  <w:num w:numId="3" w16cid:durableId="926839764">
+  <w:num w:numId="3" w16cid:durableId="2048140435">
     <w:abstractNumId w:val="0"/>
   </w:num>
 </w:numbering>

</xml_diff>